<commit_message>
Size Settings to each pane, tidy the Word and Excel samples
- The Settings window now resizes to fit whichever pane is showing.
  Before, the AI pane was cut off below the review rules.
- The Word sample's table has borders Quick Look can draw, and the
  spreadsheet's title no longer runs under gridlines.
- macOS only asks when Handa takes a file type over from another app,
  so the messages say it may ask rather than that it will.
</commit_message>
<xml_diff>
--- a/Samples/Team Meeting.docx
+++ b/Samples/Team Meeting.docx
@@ -120,8 +120,8 @@
     </w:p>
     <w:tbl>
       <w:tblPr>
-        <w:tblStyle w:val="LightGrid-Accent1"/>
         <w:tblW w:type="auto" w:w="0"/>
+        <w:tblLayout w:type="fixed"/>
         <w:tblLook w:firstColumn="1" w:firstRow="1" w:lastColumn="0" w:lastRow="0" w:noHBand="0" w:noVBand="1" w:val="04A0"/>
       </w:tblPr>
       <w:tblGrid>
@@ -132,30 +132,69 @@
       <w:tr>
         <w:tc>
           <w:tcPr>
-            <w:tcW w:type="dxa" w:w="3120"/>
+            <w:tcW w:type="dxa" w:w="5616"/>
+            <w:tcBorders>
+              <w:top w:val="single" w:sz="6" w:color="E2D6CD"/>
+              <w:left w:val="single" w:sz="6" w:color="E2D6CD"/>
+              <w:bottom w:val="single" w:sz="6" w:color="E2D6CD"/>
+              <w:right w:val="single" w:sz="6" w:color="E2D6CD"/>
+            </w:tcBorders>
+            <w:shd w:val="clear" w:color="auto" w:fill="FBEDE4"/>
           </w:tcPr>
           <w:p>
+            <w:pPr>
+              <w:spacing w:before="60" w:after="60"/>
+            </w:pPr>
             <w:r>
+              <w:rPr>
+                <w:b/>
+              </w:rPr>
               <w:t>Task</w:t>
             </w:r>
           </w:p>
         </w:tc>
         <w:tc>
           <w:tcPr>
-            <w:tcW w:type="dxa" w:w="3120"/>
+            <w:tcW w:type="dxa" w:w="1872"/>
+            <w:tcBorders>
+              <w:top w:val="single" w:sz="6" w:color="E2D6CD"/>
+              <w:left w:val="single" w:sz="6" w:color="E2D6CD"/>
+              <w:bottom w:val="single" w:sz="6" w:color="E2D6CD"/>
+              <w:right w:val="single" w:sz="6" w:color="E2D6CD"/>
+            </w:tcBorders>
+            <w:shd w:val="clear" w:color="auto" w:fill="FBEDE4"/>
           </w:tcPr>
           <w:p>
+            <w:pPr>
+              <w:spacing w:before="60" w:after="60"/>
+            </w:pPr>
             <w:r>
+              <w:rPr>
+                <w:b/>
+              </w:rPr>
               <w:t>Owner</w:t>
             </w:r>
           </w:p>
         </w:tc>
         <w:tc>
           <w:tcPr>
-            <w:tcW w:type="dxa" w:w="3120"/>
+            <w:tcW w:type="dxa" w:w="1872"/>
+            <w:tcBorders>
+              <w:top w:val="single" w:sz="6" w:color="E2D6CD"/>
+              <w:left w:val="single" w:sz="6" w:color="E2D6CD"/>
+              <w:bottom w:val="single" w:sz="6" w:color="E2D6CD"/>
+              <w:right w:val="single" w:sz="6" w:color="E2D6CD"/>
+            </w:tcBorders>
+            <w:shd w:val="clear" w:color="auto" w:fill="FBEDE4"/>
           </w:tcPr>
           <w:p>
+            <w:pPr>
+              <w:spacing w:before="60" w:after="60"/>
+            </w:pPr>
             <w:r>
+              <w:rPr>
+                <w:b/>
+              </w:rPr>
               <w:t>Due</w:t>
             </w:r>
           </w:p>
@@ -164,9 +203,18 @@
       <w:tr>
         <w:tc>
           <w:tcPr>
-            <w:tcW w:type="dxa" w:w="3120"/>
+            <w:tcW w:type="dxa" w:w="5616"/>
+            <w:tcBorders>
+              <w:top w:val="single" w:sz="6" w:color="E2D6CD"/>
+              <w:left w:val="single" w:sz="6" w:color="E2D6CD"/>
+              <w:bottom w:val="single" w:sz="6" w:color="E2D6CD"/>
+              <w:right w:val="single" w:sz="6" w:color="E2D6CD"/>
+            </w:tcBorders>
           </w:tcPr>
           <w:p>
+            <w:pPr>
+              <w:spacing w:before="60" w:after="60"/>
+            </w:pPr>
             <w:r>
               <w:t>Finalise chestnut tart recipe</w:t>
             </w:r>
@@ -174,9 +222,18 @@
         </w:tc>
         <w:tc>
           <w:tcPr>
-            <w:tcW w:type="dxa" w:w="3120"/>
+            <w:tcW w:type="dxa" w:w="1872"/>
+            <w:tcBorders>
+              <w:top w:val="single" w:sz="6" w:color="E2D6CD"/>
+              <w:left w:val="single" w:sz="6" w:color="E2D6CD"/>
+              <w:bottom w:val="single" w:sz="6" w:color="E2D6CD"/>
+              <w:right w:val="single" w:sz="6" w:color="E2D6CD"/>
+            </w:tcBorders>
           </w:tcPr>
           <w:p>
+            <w:pPr>
+              <w:spacing w:before="60" w:after="60"/>
+            </w:pPr>
             <w:r>
               <w:t>Priya</w:t>
             </w:r>
@@ -184,9 +241,18 @@
         </w:tc>
         <w:tc>
           <w:tcPr>
-            <w:tcW w:type="dxa" w:w="3120"/>
+            <w:tcW w:type="dxa" w:w="1872"/>
+            <w:tcBorders>
+              <w:top w:val="single" w:sz="6" w:color="E2D6CD"/>
+              <w:left w:val="single" w:sz="6" w:color="E2D6CD"/>
+              <w:bottom w:val="single" w:sz="6" w:color="E2D6CD"/>
+              <w:right w:val="single" w:sz="6" w:color="E2D6CD"/>
+            </w:tcBorders>
           </w:tcPr>
           <w:p>
+            <w:pPr>
+              <w:spacing w:before="60" w:after="60"/>
+            </w:pPr>
             <w:r>
               <w:t>2 Oct</w:t>
             </w:r>
@@ -196,9 +262,18 @@
       <w:tr>
         <w:tc>
           <w:tcPr>
-            <w:tcW w:type="dxa" w:w="3120"/>
+            <w:tcW w:type="dxa" w:w="5616"/>
+            <w:tcBorders>
+              <w:top w:val="single" w:sz="6" w:color="E2D6CD"/>
+              <w:left w:val="single" w:sz="6" w:color="E2D6CD"/>
+              <w:bottom w:val="single" w:sz="6" w:color="E2D6CD"/>
+              <w:right w:val="single" w:sz="6" w:color="E2D6CD"/>
+            </w:tcBorders>
           </w:tcPr>
           <w:p>
+            <w:pPr>
+              <w:spacing w:before="60" w:after="60"/>
+            </w:pPr>
             <w:r>
               <w:t>Get flour quotes from two mills</w:t>
             </w:r>
@@ -206,9 +281,18 @@
         </w:tc>
         <w:tc>
           <w:tcPr>
-            <w:tcW w:type="dxa" w:w="3120"/>
+            <w:tcW w:type="dxa" w:w="1872"/>
+            <w:tcBorders>
+              <w:top w:val="single" w:sz="6" w:color="E2D6CD"/>
+              <w:left w:val="single" w:sz="6" w:color="E2D6CD"/>
+              <w:bottom w:val="single" w:sz="6" w:color="E2D6CD"/>
+              <w:right w:val="single" w:sz="6" w:color="E2D6CD"/>
+            </w:tcBorders>
           </w:tcPr>
           <w:p>
+            <w:pPr>
+              <w:spacing w:before="60" w:after="60"/>
+            </w:pPr>
             <w:r>
               <w:t>Maya</w:t>
             </w:r>
@@ -216,9 +300,18 @@
         </w:tc>
         <w:tc>
           <w:tcPr>
-            <w:tcW w:type="dxa" w:w="3120"/>
+            <w:tcW w:type="dxa" w:w="1872"/>
+            <w:tcBorders>
+              <w:top w:val="single" w:sz="6" w:color="E2D6CD"/>
+              <w:left w:val="single" w:sz="6" w:color="E2D6CD"/>
+              <w:bottom w:val="single" w:sz="6" w:color="E2D6CD"/>
+              <w:right w:val="single" w:sz="6" w:color="E2D6CD"/>
+            </w:tcBorders>
           </w:tcPr>
           <w:p>
+            <w:pPr>
+              <w:spacing w:before="60" w:after="60"/>
+            </w:pPr>
             <w:r>
               <w:t>5 Oct</w:t>
             </w:r>
@@ -228,9 +321,18 @@
       <w:tr>
         <w:tc>
           <w:tcPr>
-            <w:tcW w:type="dxa" w:w="3120"/>
+            <w:tcW w:type="dxa" w:w="5616"/>
+            <w:tcBorders>
+              <w:top w:val="single" w:sz="6" w:color="E2D6CD"/>
+              <w:left w:val="single" w:sz="6" w:color="E2D6CD"/>
+              <w:bottom w:val="single" w:sz="6" w:color="E2D6CD"/>
+              <w:right w:val="single" w:sz="6" w:color="E2D6CD"/>
+            </w:tcBorders>
           </w:tcPr>
           <w:p>
+            <w:pPr>
+              <w:spacing w:before="60" w:after="60"/>
+            </w:pPr>
             <w:r>
               <w:t>Rota for Riverside Sundays</w:t>
             </w:r>
@@ -238,9 +340,18 @@
         </w:tc>
         <w:tc>
           <w:tcPr>
-            <w:tcW w:type="dxa" w:w="3120"/>
+            <w:tcW w:type="dxa" w:w="1872"/>
+            <w:tcBorders>
+              <w:top w:val="single" w:sz="6" w:color="E2D6CD"/>
+              <w:left w:val="single" w:sz="6" w:color="E2D6CD"/>
+              <w:bottom w:val="single" w:sz="6" w:color="E2D6CD"/>
+              <w:right w:val="single" w:sz="6" w:color="E2D6CD"/>
+            </w:tcBorders>
           </w:tcPr>
           <w:p>
+            <w:pPr>
+              <w:spacing w:before="60" w:after="60"/>
+            </w:pPr>
             <w:r>
               <w:t>Tom</w:t>
             </w:r>
@@ -248,9 +359,18 @@
         </w:tc>
         <w:tc>
           <w:tcPr>
-            <w:tcW w:type="dxa" w:w="3120"/>
+            <w:tcW w:type="dxa" w:w="1872"/>
+            <w:tcBorders>
+              <w:top w:val="single" w:sz="6" w:color="E2D6CD"/>
+              <w:left w:val="single" w:sz="6" w:color="E2D6CD"/>
+              <w:bottom w:val="single" w:sz="6" w:color="E2D6CD"/>
+              <w:right w:val="single" w:sz="6" w:color="E2D6CD"/>
+            </w:tcBorders>
           </w:tcPr>
           <w:p>
+            <w:pPr>
+              <w:spacing w:before="60" w:after="60"/>
+            </w:pPr>
             <w:r>
               <w:t>28 Sep</w:t>
             </w:r>
@@ -260,9 +380,18 @@
       <w:tr>
         <w:tc>
           <w:tcPr>
-            <w:tcW w:type="dxa" w:w="3120"/>
+            <w:tcW w:type="dxa" w:w="5616"/>
+            <w:tcBorders>
+              <w:top w:val="single" w:sz="6" w:color="E2D6CD"/>
+              <w:left w:val="single" w:sz="6" w:color="E2D6CD"/>
+              <w:bottom w:val="single" w:sz="6" w:color="E2D6CD"/>
+              <w:right w:val="single" w:sz="6" w:color="E2D6CD"/>
+            </w:tcBorders>
           </w:tcPr>
           <w:p>
+            <w:pPr>
+              <w:spacing w:before="60" w:after="60"/>
+            </w:pPr>
             <w:r>
               <w:t>Update menu boards and website</w:t>
             </w:r>
@@ -270,9 +399,18 @@
         </w:tc>
         <w:tc>
           <w:tcPr>
-            <w:tcW w:type="dxa" w:w="3120"/>
+            <w:tcW w:type="dxa" w:w="1872"/>
+            <w:tcBorders>
+              <w:top w:val="single" w:sz="6" w:color="E2D6CD"/>
+              <w:left w:val="single" w:sz="6" w:color="E2D6CD"/>
+              <w:bottom w:val="single" w:sz="6" w:color="E2D6CD"/>
+              <w:right w:val="single" w:sz="6" w:color="E2D6CD"/>
+            </w:tcBorders>
           </w:tcPr>
           <w:p>
+            <w:pPr>
+              <w:spacing w:before="60" w:after="60"/>
+            </w:pPr>
             <w:r>
               <w:t>Sam</w:t>
             </w:r>
@@ -280,9 +418,18 @@
         </w:tc>
         <w:tc>
           <w:tcPr>
-            <w:tcW w:type="dxa" w:w="3120"/>
+            <w:tcW w:type="dxa" w:w="1872"/>
+            <w:tcBorders>
+              <w:top w:val="single" w:sz="6" w:color="E2D6CD"/>
+              <w:left w:val="single" w:sz="6" w:color="E2D6CD"/>
+              <w:bottom w:val="single" w:sz="6" w:color="E2D6CD"/>
+              <w:right w:val="single" w:sz="6" w:color="E2D6CD"/>
+            </w:tcBorders>
           </w:tcPr>
           <w:p>
+            <w:pPr>
+              <w:spacing w:before="60" w:after="60"/>
+            </w:pPr>
             <w:r>
               <w:t>14 Oct</w:t>
             </w:r>

</xml_diff>

<commit_message>
Give the Word sample's table its full width, screenshot the General pane
</commit_message>
<xml_diff>
--- a/Samples/Team Meeting.docx
+++ b/Samples/Team Meeting.docx
@@ -120,14 +120,14 @@
     </w:p>
     <w:tbl>
       <w:tblPr>
-        <w:tblW w:type="auto" w:w="0"/>
+        <w:tblW w:type="pct" w:w="5000"/>
         <w:tblLayout w:type="fixed"/>
         <w:tblLook w:firstColumn="1" w:firstRow="1" w:lastColumn="0" w:lastRow="0" w:noHBand="0" w:noVBand="1" w:val="04A0"/>
       </w:tblPr>
       <w:tblGrid>
-        <w:gridCol w:w="3120"/>
-        <w:gridCol w:w="3120"/>
-        <w:gridCol w:w="3120"/>
+        <w:gridCol w:w="5616"/>
+        <w:gridCol w:w="1872"/>
+        <w:gridCol w:w="1872"/>
       </w:tblGrid>
       <w:tr>
         <w:tc>

</xml_diff>